<commit_message>
Correct R8 chapter caps and CSV column in module proofs
</commit_message>
<xml_diff>
--- a/lernskripte/ML_R8_Grundlagen_BKWI1_A4_Desktop_Prueffassung.docx
+++ b/lernskripte/ML_R8_Grundlagen_BKWI1_A4_Desktop_Prueffassung.docx
@@ -47,38 +47,6 @@
               <w:rPr>
                 <w:rFonts w:ascii="Arial" w:hAnsi="Arial" w:eastAsia="Arial" w:cs="Arial"/>
               </w:rPr>
-              <w:drawing>
-                <wp:inline xmlns:a="http://schemas.openxmlformats.org/drawingml/2006/main" xmlns:pic="http://schemas.openxmlformats.org/drawingml/2006/picture">
-                  <wp:extent cx="5040000" cy="1680000"/>
-                  <wp:docPr id="1" name="Picture 1" title="EduCode Logo" descr="EduCode Logo mit fünf farbigen Kreisen"/>
-                  <wp:cNvGraphicFramePr>
-                    <a:graphicFrameLocks noChangeAspect="1"/>
-                  </wp:cNvGraphicFramePr>
-                  <a:graphic>
-                    <a:graphicData uri="http://schemas.openxmlformats.org/drawingml/2006/picture">
-                      <pic:pic>
-                        <pic:nvPicPr>
-                          <pic:cNvPr id="0" name="image1.png"/>
-                          <pic:cNvPicPr/>
-                        </pic:nvPicPr>
-                        <pic:blipFill>
-                          <a:blip r:embed="rId26"/>
-                          <a:stretch>
-                            <a:fillRect/>
-                          </a:stretch>
-                        </pic:blipFill>
-                        <pic:spPr>
-                          <a:xfrm>
-                            <a:off x="0" y="0"/>
-                            <a:ext cx="5040000" cy="1680000"/>
-                          </a:xfrm>
-                          <a:prstGeom prst="rect"/>
-                        </pic:spPr>
-                      </pic:pic>
-                    </a:graphicData>
-                  </a:graphic>
-                </wp:inline>
-              </w:drawing>
             </w:r>
           </w:p>
           <w:p>
@@ -93,10 +61,10 @@
                 <w:color w:val="17324D"/>
                 <w:sz w:val="68"/>
               </w:rPr>
-              <w:t>Machine Learning und
-Künstliche Intelligenz</w:t>
+              <w:t>Machine Learning und</w:t>
               <w:br/>
-              <w:t/>
+              <w:t>Künstliche Intelligenz</w:t>
+              <w:br/>
             </w:r>
           </w:p>
           <w:p>
@@ -197,40 +165,7 @@
               <w:spacing w:after="160"/>
               <w:ind w:left="1049" w:hanging="1049"/>
             </w:pPr>
-            <w:r>
-              <w:drawing>
-                <wp:inline xmlns:a="http://schemas.openxmlformats.org/drawingml/2006/main" xmlns:pic="http://schemas.openxmlformats.org/drawingml/2006/picture">
-                  <wp:extent cx="306000" cy="306000"/>
-                  <wp:docPr id="11" name="Picture 11" title="Wegweiser" descr="Schwarzes Outline-Symbol eines Wegweisers für die Arbeitsorientierung"/>
-                  <wp:cNvGraphicFramePr>
-                    <a:graphicFrameLocks noChangeAspect="1"/>
-                  </wp:cNvGraphicFramePr>
-                  <a:graphic>
-                    <a:graphicData uri="http://schemas.openxmlformats.org/drawingml/2006/picture">
-                      <pic:pic>
-                        <pic:nvPicPr>
-                          <pic:cNvPr id="0" name="icon_arbeitsweise_wegweiser.png"/>
-                          <pic:cNvPicPr/>
-                        </pic:nvPicPr>
-                        <pic:blipFill>
-                          <a:blip r:embed="rId20"/>
-                          <a:stretch>
-                            <a:fillRect/>
-                          </a:stretch>
-                        </pic:blipFill>
-                        <pic:spPr>
-                          <a:xfrm>
-                            <a:off x="0" y="0"/>
-                            <a:ext cx="306000" cy="306000"/>
-                          </a:xfrm>
-                          <a:prstGeom prst="rect"/>
-                        </pic:spPr>
-                      </pic:pic>
-                    </a:graphicData>
-                  </a:graphic>
-                </wp:inline>
-              </w:drawing>
-            </w:r>
+            <w:r/>
             <w:r>
               <w:rPr>
                 <w:rFonts w:ascii="Arial" w:hAnsi="Arial" w:eastAsia="Arial" w:cs="Arial"/>
@@ -30589,14 +30524,7 @@
               <w:spacing w:after="80"/>
             </w:pPr>
             <w:r>
-              <w:rPr>
-                <w:b/>
-              </w:rPr>
-              <w:t>Ausgangssituation</w:t>
-              <w:br/>
-            </w:r>
-            <w:r>
-              <w:t>Du erschließt dir in diesem Kapitel „Chancen, Risiken und Einsatzregeln“ anhand der vorhandenen betrieblichen oder technischen Ausgangslage.</w:t>
+              <w:t>Die Schülervertretung möchte den Lernagenten im Unterricht testen. Vorher muss das Team für vier vorgeschlagene Funktionen festlegen, welche Entscheidung ein System treffen darf und wo Menschen prüfen müssen.</w:t>
             </w:r>
           </w:p>
           <w:p>
@@ -30604,14 +30532,7 @@
               <w:spacing w:before="100"/>
             </w:pPr>
             <w:r>
-              <w:rPr>
-                <w:b/>
-              </w:rPr>
-              <w:t>Aufgabe – Jetzt tun</w:t>
-              <w:br/>
-            </w:r>
-            <w:r>
-              <w:t>ML-K12-A01 · 9.4 Fallentscheidung: Darf der Lernagent das?</w:t>
+              <w:t>Einstieg: Lies in 12.2 die vier Funktionen A–D und die Tabelle Chance/Risiko/Schutzmaßnahme. Beginne mit einer Zeile für Funktion A.</w:t>
             </w:r>
           </w:p>
         </w:tc>
@@ -30623,18 +30544,6 @@
       </w:pPr>
       <w:r>
         <w:t>ML-K12-A01 · Fallentscheidung: Darf der Lernagent das?</w:t>
-      </w:r>
-    </w:p>
-    <w:p>
-      <w:pPr>
-        <w:shd w:fill="FFF1DD"/>
-        <w:pBdr>
-          <w:left w:val="single" w:sz="16" w:space="8" w:color="D9822B"/>
-        </w:pBdr>
-        <w:ind w:left="220"/>
-      </w:pPr>
-      <w:r>
-        <w:t>Material: `Aufgabenblatt ML-K12-A01` · Abgabe: `abgaben/ML-K12-A01` · Prüfnachweis: Ergebnis, Deutung, mindestens ein Test- oder Grenzfall.</w:t>
       </w:r>
     </w:p>
     <w:p>
@@ -30750,7 +30659,7 @@
         <w:pStyle w:val="R8Information"/>
       </w:pPr>
       <w:r>
-        <w:t>Durchgearbeitetes Parallelbeispiel – Parallelbeispiel – automatische Erinnerungsnachricht: Die Schulbücherei könnte an eine fällige Rückgabe erinnern. Nutzen: weniger vergessene Bücher. Risiko: eine Nachricht geht wegen einer falschen Zuordnung an die falsche Person. Eine mögliche Fallentscheidung lautet daher: zunächst nur mit einem Testdatensatz und vor dem Versand mit kontrollierter Empfängerliste erproben; zuständig bleibt das Büchereiteam. Der Fall ist keine Entscheidung über die vier Funktionen des Lernagenten.</w:t>
+        <w:t>Durchgearbeitetes Parallelbeispiel – automatische Erinnerungsnachricht: Die Schulbücherei könnte an eine fällige Rückgabe erinnern. Nutzen: weniger vergessene Bücher. Risiko: eine Nachricht geht wegen einer falschen Zuordnung an die falsche Person. Eine mögliche Fallentscheidung lautet daher: zunächst nur mit einem Testdatensatz und vor dem Versand mit kontrollierter Empfängerliste erproben; zuständig bleibt das Büchereiteam. Der Fall ist keine Entscheidung über die vier Funktionen des Lernagenten.</w:t>
       </w:r>
     </w:p>
     <w:p>

</xml_diff>

<commit_message>
Restore approved EduCode logo in R8 module covers
</commit_message>
<xml_diff>
--- a/lernskripte/ML_R8_Grundlagen_BKWI1_A4_Desktop_Prueffassung.docx
+++ b/lernskripte/ML_R8_Grundlagen_BKWI1_A4_Desktop_Prueffassung.docx
@@ -47,6 +47,40 @@
               <w:rPr>
                 <w:rFonts w:ascii="Arial" w:hAnsi="Arial" w:eastAsia="Arial" w:cs="Arial"/>
               </w:rPr>
+            </w:r>
+            <w:r>
+              <w:drawing>
+                <wp:inline xmlns:a="http://schemas.openxmlformats.org/drawingml/2006/main" xmlns:pic="http://schemas.openxmlformats.org/drawingml/2006/picture">
+                  <wp:extent cx="5040000" cy="1680000"/>
+                  <wp:docPr id="14" name="Picture 14" title="EduCode Logo" descr="EduCode Logo mit fünf farbigen Kreisen"/>
+                  <wp:cNvGraphicFramePr>
+                    <a:graphicFrameLocks noChangeAspect="1"/>
+                  </wp:cNvGraphicFramePr>
+                  <a:graphic>
+                    <a:graphicData uri="http://schemas.openxmlformats.org/drawingml/2006/picture">
+                      <pic:pic>
+                        <pic:nvPicPr>
+                          <pic:cNvPr id="0" name="image.png"/>
+                          <pic:cNvPicPr/>
+                        </pic:nvPicPr>
+                        <pic:blipFill>
+                          <a:blip r:embed="rId26"/>
+                          <a:stretch>
+                            <a:fillRect/>
+                          </a:stretch>
+                        </pic:blipFill>
+                        <pic:spPr>
+                          <a:xfrm>
+                            <a:off x="0" y="0"/>
+                            <a:ext cx="5040000" cy="1680000"/>
+                          </a:xfrm>
+                          <a:prstGeom prst="rect"/>
+                        </pic:spPr>
+                      </pic:pic>
+                    </a:graphicData>
+                  </a:graphic>
+                </wp:inline>
+              </w:drawing>
             </w:r>
           </w:p>
           <w:p>

</xml_diff>